<commit_message>
docs(references): actualizar cifras del ML Canvas
</commit_message>
<xml_diff>
--- a/references/ML_Canvas_MiBici_Equipo03.docx
+++ b/references/ML_Canvas_MiBici_Equipo03.docx
@@ -185,9 +185,9 @@
         <w:tblLook w:val="0600" w:firstRow="0" w:lastRow="0" w:firstColumn="0" w:lastColumn="0" w:noHBand="1" w:noVBand="1"/>
       </w:tblPr>
       <w:tblGrid>
-        <w:gridCol w:w="3089"/>
-        <w:gridCol w:w="2835"/>
-        <w:gridCol w:w="2791"/>
+        <w:gridCol w:w="2955"/>
+        <w:gridCol w:w="2880"/>
+        <w:gridCol w:w="2880"/>
         <w:gridCol w:w="2880"/>
         <w:gridCol w:w="2880"/>
       </w:tblGrid>
@@ -198,7 +198,7 @@
         </w:trPr>
         <w:tc>
           <w:tcPr>
-            <w:tcW w:w="3089" w:type="dxa"/>
+            <w:tcW w:w="2955" w:type="dxa"/>
             <w:tcBorders>
               <w:top w:val="single" w:sz="24" w:space="0" w:color="000000"/>
               <w:left w:val="single" w:sz="24" w:space="0" w:color="000000"/>
@@ -231,7 +231,7 @@
                 <w:noProof/>
               </w:rPr>
               <w:drawing>
-                <wp:anchor distT="0" distB="0" distL="0" distR="0" simplePos="0" relativeHeight="251658240" behindDoc="0" locked="0" layoutInCell="1" hidden="0" allowOverlap="1" wp14:anchorId="3DCFC796" wp14:editId="6728A7B9">
+                <wp:anchor distT="0" distB="0" distL="0" distR="0" simplePos="0" relativeHeight="251658240" behindDoc="0" locked="0" layoutInCell="1" hidden="0" allowOverlap="1" wp14:anchorId="1AA75060" wp14:editId="1FC336D6">
                   <wp:simplePos x="0" y="0"/>
                   <wp:positionH relativeFrom="column">
                     <wp:posOffset>1390650</wp:posOffset>
@@ -377,7 +377,7 @@
                 <w:sz w:val="13"/>
                 <w:szCs w:val="13"/>
               </w:rPr>
-              <w:t>Clasificación. Estación × bloque de 3 h: en riesgo si |salidas − llegadas| ≥ 40 % de la capacidad en el siguiente bloque.</w:t>
+              <w:t>Clasificación. Estación × bloque de 3 h: en riesgo si |salidas − llegadas| ≥ 40 % de la capacidad en el siguiente bloque.</w:t>
             </w:r>
           </w:p>
           <w:p>
@@ -427,13 +427,13 @@
                 <w:sz w:val="13"/>
                 <w:szCs w:val="13"/>
               </w:rPr>
-              <w:t>Sin inventario, se usa el flujo neto: con la estación a la mitad, mover 40 % deja solo 10 % de margen.</w:t>
+              <w:t>Sin inventario, se usa el flujo neto: con la estación a la mitad, mover 40 % deja solo 10 % de margen.</w:t>
             </w:r>
           </w:p>
         </w:tc>
         <w:tc>
           <w:tcPr>
-            <w:tcW w:w="2835" w:type="dxa"/>
+            <w:tcW w:w="2880" w:type="dxa"/>
             <w:tcBorders>
               <w:top w:val="single" w:sz="24" w:space="0" w:color="000000"/>
               <w:right w:val="single" w:sz="12" w:space="0" w:color="000000"/>
@@ -466,7 +466,7 @@
                 <w:noProof/>
               </w:rPr>
               <w:drawing>
-                <wp:anchor distT="0" distB="0" distL="0" distR="0" simplePos="0" relativeHeight="251659264" behindDoc="0" locked="0" layoutInCell="1" hidden="0" allowOverlap="1" wp14:anchorId="1DB74312" wp14:editId="1A94BB5E">
+                <wp:anchor distT="0" distB="0" distL="0" distR="0" simplePos="0" relativeHeight="251659264" behindDoc="0" locked="0" layoutInCell="1" hidden="0" allowOverlap="1" wp14:anchorId="1F1B7FEB" wp14:editId="7D071B7B">
                   <wp:simplePos x="0" y="0"/>
                   <wp:positionH relativeFrom="column">
                     <wp:posOffset>1371600</wp:posOffset>
@@ -608,7 +608,7 @@
         </w:tc>
         <w:tc>
           <w:tcPr>
-            <w:tcW w:w="2791" w:type="dxa"/>
+            <w:tcW w:w="2880" w:type="dxa"/>
             <w:tcBorders>
               <w:top w:val="single" w:sz="24" w:space="0" w:color="000000"/>
               <w:left w:val="single" w:sz="12" w:space="0" w:color="000000"/>
@@ -643,7 +643,7 @@
                 <w:noProof/>
               </w:rPr>
               <w:drawing>
-                <wp:anchor distT="0" distB="0" distL="0" distR="0" simplePos="0" relativeHeight="251660288" behindDoc="0" locked="0" layoutInCell="1" hidden="0" allowOverlap="1" wp14:anchorId="56E4D6F8" wp14:editId="2417CF6C">
+                <wp:anchor distT="0" distB="0" distL="0" distR="0" simplePos="0" relativeHeight="251660288" behindDoc="0" locked="0" layoutInCell="1" hidden="0" allowOverlap="1" wp14:anchorId="14B637F8" wp14:editId="2D8DE95B">
                   <wp:simplePos x="0" y="0"/>
                   <wp:positionH relativeFrom="column">
                     <wp:posOffset>1333500</wp:posOffset>
@@ -827,7 +827,7 @@
                 <w:noProof/>
               </w:rPr>
               <w:drawing>
-                <wp:anchor distT="0" distB="0" distL="0" distR="0" simplePos="0" relativeHeight="251661312" behindDoc="0" locked="0" layoutInCell="1" hidden="0" allowOverlap="1" wp14:anchorId="407D2838" wp14:editId="1C7CB8D9">
+                <wp:anchor distT="0" distB="0" distL="0" distR="0" simplePos="0" relativeHeight="251661312" behindDoc="0" locked="0" layoutInCell="1" hidden="0" allowOverlap="1" wp14:anchorId="383E0DBE" wp14:editId="3FA20904">
                   <wp:simplePos x="0" y="0"/>
                   <wp:positionH relativeFrom="column">
                     <wp:posOffset>1352550</wp:posOffset>
@@ -925,7 +925,7 @@
                 <w:sz w:val="13"/>
                 <w:szCs w:val="13"/>
               </w:rPr>
-              <w:t>Limpieza: duraciones negativas, &lt; 2 min en la misma estación, &gt; 12 h y duplicados.</w:t>
+              <w:t>Limpieza: duraciones negativas, &lt; 2 min en la misma estación, &gt; 12 h, duplicados y nacimientos antes de 1920.</w:t>
             </w:r>
           </w:p>
           <w:p>
@@ -978,7 +978,7 @@
                 <w:noProof/>
               </w:rPr>
               <w:drawing>
-                <wp:anchor distT="0" distB="0" distL="0" distR="0" simplePos="0" relativeHeight="251662336" behindDoc="0" locked="0" layoutInCell="1" hidden="0" allowOverlap="1" wp14:anchorId="77CC21C3" wp14:editId="6D383A3C">
+                <wp:anchor distT="0" distB="0" distL="0" distR="0" simplePos="0" relativeHeight="251662336" behindDoc="0" locked="0" layoutInCell="1" hidden="0" allowOverlap="1" wp14:anchorId="4640B3DF" wp14:editId="3B414E8C">
                   <wp:simplePos x="0" y="0"/>
                   <wp:positionH relativeFrom="column">
                     <wp:posOffset>1352550</wp:posOffset>
@@ -1064,7 +1064,7 @@
                 <w:sz w:val="13"/>
                 <w:szCs w:val="13"/>
               </w:rPr>
-              <w:t>datos_abiertos_AAAA_MM.csv, oct 2025 a sep 2026: 4,332,984 viajes limpios.</w:t>
+              <w:t>datos_abiertos_AAAA_MM.csv, oct 2025 a sep 2026: 4,332,379 viajes limpios.</w:t>
             </w:r>
           </w:p>
           <w:p>
@@ -1126,7 +1126,7 @@
         </w:trPr>
         <w:tc>
           <w:tcPr>
-            <w:tcW w:w="3089" w:type="dxa"/>
+            <w:tcW w:w="2955" w:type="dxa"/>
             <w:tcBorders>
               <w:left w:val="single" w:sz="24" w:space="0" w:color="000000"/>
               <w:bottom w:val="nil"/>
@@ -1159,7 +1159,7 @@
                 <w:noProof/>
               </w:rPr>
               <w:drawing>
-                <wp:anchor distT="0" distB="0" distL="0" distR="0" simplePos="0" relativeHeight="251663360" behindDoc="0" locked="0" layoutInCell="1" hidden="0" allowOverlap="1" wp14:anchorId="211F0E81" wp14:editId="3F7C2455">
+                <wp:anchor distT="0" distB="0" distL="0" distR="0" simplePos="0" relativeHeight="251663360" behindDoc="0" locked="0" layoutInCell="1" hidden="0" allowOverlap="1" wp14:anchorId="536F3736" wp14:editId="6CA5F119">
                   <wp:simplePos x="0" y="0"/>
                   <wp:positionH relativeFrom="column">
                     <wp:posOffset>1390650</wp:posOffset>
@@ -1353,7 +1353,7 @@
         </w:tc>
         <w:tc>
           <w:tcPr>
-            <w:tcW w:w="2835" w:type="dxa"/>
+            <w:tcW w:w="2880" w:type="dxa"/>
             <w:tcBorders>
               <w:bottom w:val="single" w:sz="12" w:space="0" w:color="000000"/>
               <w:right w:val="single" w:sz="12" w:space="0" w:color="000000"/>
@@ -1388,7 +1388,7 @@
                 <w:noProof/>
               </w:rPr>
               <w:drawing>
-                <wp:anchor distT="0" distB="0" distL="0" distR="0" simplePos="0" relativeHeight="251664384" behindDoc="0" locked="0" layoutInCell="1" hidden="0" allowOverlap="1" wp14:anchorId="188AB6EF" wp14:editId="1C98B170">
+                <wp:anchor distT="0" distB="0" distL="0" distR="0" simplePos="0" relativeHeight="251664384" behindDoc="0" locked="0" layoutInCell="1" hidden="0" allowOverlap="1" wp14:anchorId="351F4E29" wp14:editId="0D063AF6">
                   <wp:simplePos x="0" y="0"/>
                   <wp:positionH relativeFrom="column">
                     <wp:posOffset>1371600</wp:posOffset>
@@ -1524,7 +1524,7 @@
         </w:tc>
         <w:tc>
           <w:tcPr>
-            <w:tcW w:w="2791" w:type="dxa"/>
+            <w:tcW w:w="2880" w:type="dxa"/>
             <w:tcBorders>
               <w:top w:val="nil"/>
               <w:left w:val="single" w:sz="12" w:space="0" w:color="000000"/>
@@ -1588,7 +1588,7 @@
                 <w:noProof/>
               </w:rPr>
               <w:drawing>
-                <wp:anchor distT="0" distB="0" distL="0" distR="0" simplePos="0" relativeHeight="251665408" behindDoc="0" locked="0" layoutInCell="1" hidden="0" allowOverlap="1" wp14:anchorId="28DBDB86" wp14:editId="1581623F">
+                <wp:anchor distT="0" distB="0" distL="0" distR="0" simplePos="0" relativeHeight="251665408" behindDoc="0" locked="0" layoutInCell="1" hidden="0" allowOverlap="1" wp14:anchorId="4310AE75" wp14:editId="72019618">
                   <wp:simplePos x="0" y="0"/>
                   <wp:positionH relativeFrom="column">
                     <wp:posOffset>1352550</wp:posOffset>
@@ -1793,7 +1793,7 @@
                 <w:noProof/>
               </w:rPr>
               <w:drawing>
-                <wp:anchor distT="0" distB="0" distL="0" distR="0" simplePos="0" relativeHeight="251666432" behindDoc="0" locked="0" layoutInCell="1" hidden="0" allowOverlap="1" wp14:anchorId="1FA2D811" wp14:editId="4547BB19">
+                <wp:anchor distT="0" distB="0" distL="0" distR="0" simplePos="0" relativeHeight="251666432" behindDoc="0" locked="0" layoutInCell="1" hidden="0" allowOverlap="1" wp14:anchorId="41E7FD85" wp14:editId="7BF5B93F">
                   <wp:simplePos x="0" y="0"/>
                   <wp:positionH relativeFrom="column">
                     <wp:posOffset>1352550</wp:posOffset>
@@ -1967,7 +1967,7 @@
         </w:trPr>
         <w:tc>
           <w:tcPr>
-            <w:tcW w:w="3089" w:type="dxa"/>
+            <w:tcW w:w="2955" w:type="dxa"/>
             <w:tcBorders>
               <w:top w:val="nil"/>
               <w:left w:val="single" w:sz="24" w:space="0" w:color="000000"/>
@@ -1992,7 +1992,7 @@
         </w:tc>
         <w:tc>
           <w:tcPr>
-            <w:tcW w:w="2835" w:type="dxa"/>
+            <w:tcW w:w="2880" w:type="dxa"/>
             <w:tcBorders>
               <w:top w:val="single" w:sz="12" w:space="0" w:color="000000"/>
               <w:left w:val="single" w:sz="12" w:space="0" w:color="000000"/>
@@ -2055,7 +2055,7 @@
         </w:tc>
         <w:tc>
           <w:tcPr>
-            <w:tcW w:w="2791" w:type="dxa"/>
+            <w:tcW w:w="2880" w:type="dxa"/>
             <w:tcBorders>
               <w:top w:val="single" w:sz="12" w:space="0" w:color="000000"/>
               <w:left w:val="nil"/>
@@ -2153,7 +2153,7 @@
                 <w:noProof/>
               </w:rPr>
               <w:drawing>
-                <wp:anchor distT="0" distB="0" distL="0" distR="0" simplePos="0" relativeHeight="251667456" behindDoc="0" locked="0" layoutInCell="1" hidden="0" allowOverlap="1" wp14:anchorId="6BE18D63" wp14:editId="46FA10F7">
+                <wp:anchor distT="0" distB="0" distL="0" distR="0" simplePos="0" relativeHeight="251667456" behindDoc="0" locked="0" layoutInCell="1" hidden="0" allowOverlap="1" wp14:anchorId="1CD08F3D" wp14:editId="0813D97A">
                   <wp:simplePos x="0" y="0"/>
                   <wp:positionH relativeFrom="column">
                     <wp:posOffset>1314450</wp:posOffset>
@@ -2289,7 +2289,7 @@
                 <w:noProof/>
               </w:rPr>
               <w:drawing>
-                <wp:inline distT="114300" distB="114300" distL="114300" distR="114300" wp14:anchorId="0269B345" wp14:editId="2C0F01E2">
+                <wp:inline distT="114300" distB="114300" distL="114300" distR="114300" wp14:anchorId="7C8AC747" wp14:editId="730BE434">
                   <wp:extent cx="190500" cy="190500"/>
                   <wp:effectExtent l="0" t="0" r="0" b="0"/>
                   <wp:docPr id="10" name="image10.png"/>
@@ -2330,7 +2330,7 @@
                 <w:noProof/>
               </w:rPr>
               <w:drawing>
-                <wp:inline distT="114300" distB="114300" distL="114300" distR="114300" wp14:anchorId="56C80E33" wp14:editId="53D595DD">
+                <wp:inline distT="114300" distB="114300" distL="114300" distR="114300" wp14:anchorId="2A3E9102" wp14:editId="3D4DC5C7">
                   <wp:extent cx="190500" cy="190500"/>
                   <wp:effectExtent l="0" t="0" r="0" b="0"/>
                   <wp:docPr id="15" name="image7.png"/>
@@ -2371,7 +2371,7 @@
                 <w:noProof/>
               </w:rPr>
               <w:drawing>
-                <wp:inline distT="114300" distB="114300" distL="114300" distR="114300" wp14:anchorId="43E3293C" wp14:editId="7CB1B67D">
+                <wp:inline distT="114300" distB="114300" distL="114300" distR="114300" wp14:anchorId="6BA94B24" wp14:editId="58B49AD7">
                   <wp:extent cx="190500" cy="190500"/>
                   <wp:effectExtent l="0" t="0" r="0" b="0"/>
                   <wp:docPr id="14" name="image9.png"/>
@@ -2412,7 +2412,7 @@
                 <w:noProof/>
               </w:rPr>
               <w:drawing>
-                <wp:inline distT="114300" distB="114300" distL="114300" distR="114300" wp14:anchorId="48B2D57E" wp14:editId="0FB514D3">
+                <wp:inline distT="114300" distB="114300" distL="114300" distR="114300" wp14:anchorId="23A50033" wp14:editId="0C05730E">
                   <wp:extent cx="190500" cy="190500"/>
                   <wp:effectExtent l="0" t="0" r="0" b="0"/>
                   <wp:docPr id="2" name="image14.png"/>
@@ -2453,7 +2453,7 @@
                 <w:noProof/>
               </w:rPr>
               <w:drawing>
-                <wp:inline distT="114300" distB="114300" distL="114300" distR="114300" wp14:anchorId="30EC9228" wp14:editId="7EAFE883">
+                <wp:inline distT="114300" distB="114300" distL="114300" distR="114300" wp14:anchorId="481BA159" wp14:editId="6709B530">
                   <wp:extent cx="190500" cy="190500"/>
                   <wp:effectExtent l="0" t="0" r="0" b="0"/>
                   <wp:docPr id="5" name="image8.png"/>
@@ -3518,9 +3518,9 @@
 <file path=word/numbering.xml><?xml version="1.0" encoding="utf-8"?>
 <w:numbering xmlns:wpc="http://schemas.microsoft.com/office/word/2010/wordprocessingCanvas" xmlns:cx="http://schemas.microsoft.com/office/drawing/2014/chartex" xmlns:cx1="http://schemas.microsoft.com/office/drawing/2015/9/8/chartex" xmlns:cx2="http://schemas.microsoft.com/office/drawing/2015/10/21/chartex" xmlns:cx3="http://schemas.microsoft.com/office/drawing/2016/5/9/chartex" xmlns:cx4="http://schemas.microsoft.com/office/drawing/2016/5/10/chartex" xmlns:cx5="http://schemas.microsoft.com/office/drawing/2016/5/11/chartex" xmlns:cx6="http://schemas.microsoft.com/office/drawing/2016/5/12/chartex" xmlns:cx7="http://schemas.microsoft.com/office/drawing/2016/5/13/chartex" xmlns:cx8="http://schemas.microsoft.com/office/drawing/2016/5/14/chartex" xmlns:mc="http://schemas.openxmlformats.org/markup-compatibility/2006" xmlns:m="http://schemas.openxmlformats.org/officeDocument/2006/math" xmlns:aink="http://schemas.microsoft.com/office/drawing/2016/ink" xmlns:am3d="http://schemas.microsoft.com/office/drawing/2017/model3d" xmlns:oel="http://schemas.microsoft.com/office/2019/extlst" xmlns:r="http://schemas.openxmlformats.org/officeDocument/2006/relationships" xmlns:wp14="http://schemas.microsoft.com/office/word/2010/wordprocessingDrawing" xmlns:wp="http://schemas.openxmlformats.org/drawingml/2006/wordprocessingDrawing" xmlns:wpg="http://schemas.microsoft.com/office/word/2010/wordprocessingGroup" xmlns:wpi="http://schemas.microsoft.com/office/word/2010/wordprocessingInk" xmlns:wps="http://schemas.microsoft.com/office/word/2010/wordprocessingShape" xmlns:o="urn:schemas-microsoft-com:office:office" xmlns:v="urn:schemas-microsoft-com:vml" xmlns:w10="urn:schemas-microsoft-com:office:word" xmlns:w="http://schemas.openxmlformats.org/wordprocessingml/2006/main" xmlns:w14="http://schemas.microsoft.com/office/word/2010/wordml" xmlns:w15="http://schemas.microsoft.com/office/word/2012/wordml" xmlns:w16cex="http://schemas.microsoft.com/office/word/2018/wordml/cex" xmlns:w16cid="http://schemas.microsoft.com/office/word/2016/wordml/cid" xmlns:w16="http://schemas.microsoft.com/office/word/2018/wordml" xmlns:w16sdtdh="http://schemas.microsoft.com/office/word/2020/wordml/sdtdatahash" xmlns:w16sdtfl="http://schemas.microsoft.com/office/word/2024/wordml/sdtformatlock" xmlns:w16se="http://schemas.microsoft.com/office/word/2015/wordml/symex" xmlns:w16du="http://schemas.microsoft.com/office/word/2023/wordml/word16du" xmlns:wne="http://schemas.microsoft.com/office/word/2006/wordml" mc:Ignorable="w14 w15 w16se w16cid w16 w16cex w16sdtdh w16sdtfl w16du wp14">
   <w:abstractNum w:abstractNumId="0" w15:restartNumberingAfterBreak="0">
-    <w:nsid w:val="35733BCA"/>
+    <w:nsid w:val="2862608A"/>
     <w:multiLevelType w:val="multilevel"/>
-    <w:tmpl w:val="F100365A"/>
+    <w:tmpl w:val="CFAA51FA"/>
     <w:lvl w:ilvl="0">
       <w:start w:val="1"/>
       <w:numFmt w:val="bullet"/>
@@ -3639,7 +3639,7 @@
       </w:rPr>
     </w:lvl>
   </w:abstractNum>
-  <w:num w:numId="1" w16cid:durableId="619073934">
+  <w:num w:numId="1" w16cid:durableId="305622724">
     <w:abstractNumId w:val="0"/>
   </w:num>
 </w:numbering>
@@ -4259,7 +4259,7 @@
     <w:link w:val="HeaderChar"/>
     <w:uiPriority w:val="99"/>
     <w:unhideWhenUsed/>
-    <w:rsid w:val="00E9690C"/>
+    <w:rsid w:val="008211DD"/>
     <w:pPr>
       <w:tabs>
         <w:tab w:val="center" w:pos="4680"/>
@@ -4273,7 +4273,7 @@
     <w:basedOn w:val="DefaultParagraphFont"/>
     <w:link w:val="Header"/>
     <w:uiPriority w:val="99"/>
-    <w:rsid w:val="00E9690C"/>
+    <w:rsid w:val="008211DD"/>
   </w:style>
   <w:style w:type="paragraph" w:styleId="Footer">
     <w:name w:val="footer"/>
@@ -4281,7 +4281,7 @@
     <w:link w:val="FooterChar"/>
     <w:uiPriority w:val="99"/>
     <w:unhideWhenUsed/>
-    <w:rsid w:val="00E9690C"/>
+    <w:rsid w:val="008211DD"/>
     <w:pPr>
       <w:tabs>
         <w:tab w:val="center" w:pos="4680"/>
@@ -4295,7 +4295,7 @@
     <w:basedOn w:val="DefaultParagraphFont"/>
     <w:link w:val="Footer"/>
     <w:uiPriority w:val="99"/>
-    <w:rsid w:val="00E9690C"/>
+    <w:rsid w:val="008211DD"/>
   </w:style>
 </w:styles>
 </file>

</xml_diff>